<commit_message>
docs(report): embed all dashboard, topology graph, login, and IDS screenshots into docx and pdf
</commit_message>
<xml_diff>
--- a/Reports/Sentinel_Firewall_Project_Report.docx
+++ b/Reports/Sentinel_Firewall_Project_Report.docx
@@ -3633,7 +3633,16 @@
         <w:pStyle w:val="Heading2"/>
       </w:pPr>
       <w:r>
-        <w:t>4.1 Administrator Authentication &amp; Command Center</w:t>
+        <w:t>4.1 Administrator Authentication &amp; Access Portal</w:t>
+      </w:r>
+    </w:p>
+    <w:p>
+      <w:pPr>
+        <w:spacing w:line="288" w:lineRule="auto" w:after="80"/>
+        <w:jc w:val="both"/>
+      </w:pPr>
+      <w:r>
+        <w:t>To guarantee role-based access control (RBAC) and prevent unauthorized modification of netfilter security policies, Sentinel implements a hardened administrative authentication portal. Access requires credential validation against pre-configured SecOps cryptographic tokens before initializing the tactical telemetry stream. Figure 2 displays the administrative authentication screen.</w:t>
       </w:r>
     </w:p>
     <w:p>
@@ -3644,7 +3653,7 @@
       <w:r>
         <w:drawing>
           <wp:inline xmlns:a="http://schemas.openxmlformats.org/drawingml/2006/main" xmlns:pic="http://schemas.openxmlformats.org/drawingml/2006/picture">
-            <wp:extent cx="3840480" cy="5054609"/>
+            <wp:extent cx="3108960" cy="4091826"/>
             <wp:docPr id="3" name="Picture 3"/>
             <wp:cNvGraphicFramePr>
               <a:graphicFrameLocks noChangeAspect="1"/>
@@ -3653,7 +3662,7 @@
               <a:graphicData uri="http://schemas.openxmlformats.org/drawingml/2006/picture">
                 <pic:pic>
                   <pic:nvPicPr>
-                    <pic:cNvPr id="0" name="fig2_login.png"/>
+                    <pic:cNvPr id="0" name="ss_login.png"/>
                     <pic:cNvPicPr/>
                   </pic:nvPicPr>
                   <pic:blipFill>
@@ -3665,7 +3674,7 @@
                   <pic:spPr>
                     <a:xfrm>
                       <a:off x="0" y="0"/>
-                      <a:ext cx="3840480" cy="5054609"/>
+                      <a:ext cx="3108960" cy="4091826"/>
                     </a:xfrm>
                     <a:prstGeom prst="rect"/>
                   </pic:spPr>
@@ -3691,11 +3700,25 @@
       </w:r>
     </w:p>
     <w:p>
+      <w:r>
+        <w:br w:type="page"/>
+      </w:r>
+    </w:p>
+    <w:p>
       <w:pPr>
         <w:pStyle w:val="Heading2"/>
       </w:pPr>
       <w:r>
-        <w:t>4.2 Live Traffic Terminal with Continuous Sequential Stream</w:t>
+        <w:t>4.2 Sentinel Command Center &amp; Overall Live Dashboard</w:t>
+      </w:r>
+    </w:p>
+    <w:p>
+      <w:pPr>
+        <w:spacing w:line="288" w:lineRule="auto" w:after="80"/>
+        <w:jc w:val="both"/>
+      </w:pPr>
+      <w:r>
+        <w:t>Upon successful authentication, the administrator is presented with the unified Command Center. The tactical HUD synthesizes high-velocity telemetry, packet throughput gauges, engine health monitors, and a live sequential packet log stream. Packets are evaluated against the active netfilter chain, rendering deterministic green [ALLOW] or red [DROP] verdicts in real time. Figure 3 shows the comprehensive dashboard view.</w:t>
       </w:r>
     </w:p>
     <w:p>
@@ -3706,7 +3729,7 @@
       <w:r>
         <w:drawing>
           <wp:inline xmlns:a="http://schemas.openxmlformats.org/drawingml/2006/main" xmlns:pic="http://schemas.openxmlformats.org/drawingml/2006/picture">
-            <wp:extent cx="4206240" cy="8500372"/>
+            <wp:extent cx="5303520" cy="2631043"/>
             <wp:docPr id="4" name="Picture 4"/>
             <wp:cNvGraphicFramePr>
               <a:graphicFrameLocks noChangeAspect="1"/>
@@ -3715,7 +3738,7 @@
               <a:graphicData uri="http://schemas.openxmlformats.org/drawingml/2006/picture">
                 <pic:pic>
                   <pic:nvPicPr>
-                    <pic:cNvPr id="0" name="fig3_terminal.png"/>
+                    <pic:cNvPr id="0" name="ss_dashboard.png"/>
                     <pic:cNvPicPr/>
                   </pic:nvPicPr>
                   <pic:blipFill>
@@ -3727,7 +3750,7 @@
                   <pic:spPr>
                     <a:xfrm>
                       <a:off x="0" y="0"/>
-                      <a:ext cx="4206240" cy="8500372"/>
+                      <a:ext cx="5303520" cy="2631043"/>
                     </a:xfrm>
                     <a:prstGeom prst="rect"/>
                   </pic:spPr>
@@ -3749,7 +3772,12 @@
           <w:color w:val="000000"/>
           <w:sz w:val="19"/>
         </w:rPr>
-        <w:t>Fig 3 : Live Traffic Terminal Streaming Real-Time Packets</w:t>
+        <w:t>Fig 3 : Sentinel Command Center Dashboard (Live Telemetry &amp; Traffic Stream)</w:t>
+      </w:r>
+    </w:p>
+    <w:p>
+      <w:r>
+        <w:br w:type="page"/>
       </w:r>
     </w:p>
     <w:p>
@@ -3757,7 +3785,16 @@
         <w:pStyle w:val="Heading2"/>
       </w:pPr>
       <w:r>
-        <w:t>4.3 Firewall Policy &amp; Rule Enforcement Manager</w:t>
+        <w:t>4.3 Interactive Network Topology Mesh Graph (Draggable Nodes &amp; Dynamic Bézier Curves)</w:t>
+      </w:r>
+    </w:p>
+    <w:p>
+      <w:pPr>
+        <w:spacing w:line="288" w:lineRule="auto" w:after="80"/>
+        <w:jc w:val="both"/>
+      </w:pPr>
+      <w:r>
+        <w:t>The interactive Network Topology Mesh Graph visualizes packet flows across spatial coordinates. The central Sentinel Core is dynamically linked to external threat actors via red dashed arcs and to authorized clients via green arcs. Protected internal assets—including MySQL databases, DMZ gateways, and web daemons—are encapsulated within the perimeter. Operators can freely reposition nodes via pointer drag-and-drop; dynamic cubic Bézier vectors recalculate in real time to maintain smooth vector arcs. Figure 4 showcases the draggable topology graph.</w:t>
       </w:r>
     </w:p>
     <w:p>
@@ -3768,7 +3805,7 @@
       <w:r>
         <w:drawing>
           <wp:inline xmlns:a="http://schemas.openxmlformats.org/drawingml/2006/main" xmlns:pic="http://schemas.openxmlformats.org/drawingml/2006/picture">
-            <wp:extent cx="5029200" cy="4611979"/>
+            <wp:extent cx="5303520" cy="3035022"/>
             <wp:docPr id="5" name="Picture 5"/>
             <wp:cNvGraphicFramePr>
               <a:graphicFrameLocks noChangeAspect="1"/>
@@ -3777,7 +3814,7 @@
               <a:graphicData uri="http://schemas.openxmlformats.org/drawingml/2006/picture">
                 <pic:pic>
                   <pic:nvPicPr>
-                    <pic:cNvPr id="0" name="fig4_rules.png"/>
+                    <pic:cNvPr id="0" name="ss_topology.png"/>
                     <pic:cNvPicPr/>
                   </pic:nvPicPr>
                   <pic:blipFill>
@@ -3789,7 +3826,7 @@
                   <pic:spPr>
                     <a:xfrm>
                       <a:off x="0" y="0"/>
-                      <a:ext cx="5029200" cy="4611979"/>
+                      <a:ext cx="5303520" cy="3035022"/>
                     </a:xfrm>
                     <a:prstGeom prst="rect"/>
                   </pic:spPr>
@@ -3811,7 +3848,12 @@
           <w:color w:val="000000"/>
           <w:sz w:val="19"/>
         </w:rPr>
-        <w:t>Fig 4 : Firewall Policy &amp; Rule Enforcement Manager Table</w:t>
+        <w:t>Fig 4 : Interactive Network Topology Mesh Graph with Draggable Nodes &amp; Dynamic Bézier Curves</w:t>
+      </w:r>
+    </w:p>
+    <w:p>
+      <w:r>
+        <w:br w:type="page"/>
       </w:r>
     </w:p>
     <w:p>
@@ -3819,7 +3861,163 @@
         <w:pStyle w:val="Heading2"/>
       </w:pPr>
       <w:r>
-        <w:t>4.4 Global IP Geolocation Threat Radar Map</w:t>
+        <w:t>4.4 Heuristic Intrusion Detection System (IDS) Engine &amp; Live Threat Feed</w:t>
+      </w:r>
+    </w:p>
+    <w:p>
+      <w:pPr>
+        <w:spacing w:line="288" w:lineRule="auto" w:after="80"/>
+        <w:jc w:val="both"/>
+      </w:pPr>
+      <w:r>
+        <w:t>The Intrusion Detection System inspects incoming traffic against known adversarial patterns, such as TCP SYN Floods (MITRE ATT&amp;CK T1498.001), horizontal port sweeps, and SSH/RDP brute force attempts. The threat intelligence console ranks alerts by severity, tallies frequency histograms, and provides 1-click 'Auto-Block IP' controls that immediately commit dynamic DROP rules to the policy engine. Figure 5 depicts the IDS threat intelligence console.</w:t>
+      </w:r>
+    </w:p>
+    <w:p>
+      <w:pPr>
+        <w:spacing w:before="120" w:after="80"/>
+        <w:jc w:val="center"/>
+      </w:pPr>
+      <w:r>
+        <w:drawing>
+          <wp:inline xmlns:a="http://schemas.openxmlformats.org/drawingml/2006/main" xmlns:pic="http://schemas.openxmlformats.org/drawingml/2006/picture">
+            <wp:extent cx="5303520" cy="3035022"/>
+            <wp:docPr id="6" name="Picture 6"/>
+            <wp:cNvGraphicFramePr>
+              <a:graphicFrameLocks noChangeAspect="1"/>
+            </wp:cNvGraphicFramePr>
+            <a:graphic>
+              <a:graphicData uri="http://schemas.openxmlformats.org/drawingml/2006/picture">
+                <pic:pic>
+                  <pic:nvPicPr>
+                    <pic:cNvPr id="0" name="ss_ids.png"/>
+                    <pic:cNvPicPr/>
+                  </pic:nvPicPr>
+                  <pic:blipFill>
+                    <a:blip r:embed="rId16"/>
+                    <a:stretch>
+                      <a:fillRect/>
+                    </a:stretch>
+                  </pic:blipFill>
+                  <pic:spPr>
+                    <a:xfrm>
+                      <a:off x="0" y="0"/>
+                      <a:ext cx="5303520" cy="3035022"/>
+                    </a:xfrm>
+                    <a:prstGeom prst="rect"/>
+                  </pic:spPr>
+                </pic:pic>
+              </a:graphicData>
+            </a:graphic>
+          </wp:inline>
+        </w:drawing>
+      </w:r>
+    </w:p>
+    <w:p>
+      <w:pPr>
+        <w:spacing w:before="40" w:after="240"/>
+        <w:jc w:val="center"/>
+      </w:pPr>
+      <w:r>
+        <w:rPr>
+          <w:b/>
+          <w:color w:val="000000"/>
+          <w:sz w:val="19"/>
+        </w:rPr>
+        <w:t>Fig 5 : Heuristic Intrusion Detection System (IDS) Engine &amp; Threat Intelligence Feed</w:t>
+      </w:r>
+    </w:p>
+    <w:p>
+      <w:r>
+        <w:br w:type="page"/>
+      </w:r>
+    </w:p>
+    <w:p>
+      <w:pPr>
+        <w:pStyle w:val="Heading2"/>
+      </w:pPr>
+      <w:r>
+        <w:t>4.5 Firewall Policy &amp; Dynamic Filtering Rules Engine (MySQL Synced)</w:t>
+      </w:r>
+    </w:p>
+    <w:p>
+      <w:pPr>
+        <w:spacing w:line="288" w:lineRule="auto" w:after="80"/>
+        <w:jc w:val="both"/>
+      </w:pPr>
+      <w:r>
+        <w:t>The Firewall Policy Manager enables granular Layer 4 rule configuration, supporting Source IP, Destination Port, Protocol (TCP/UDP/ICMP), and Action (ALLOW/DROP). Policies are synchronized with a backend MySQL database ('firewall_db'), maintaining persistent hit counters and bandwidth tallies across reboots. Figure 6 displays the configured rules table with real-time hit counts.</w:t>
+      </w:r>
+    </w:p>
+    <w:p>
+      <w:pPr>
+        <w:spacing w:before="120" w:after="80"/>
+        <w:jc w:val="center"/>
+      </w:pPr>
+      <w:r>
+        <w:drawing>
+          <wp:inline xmlns:a="http://schemas.openxmlformats.org/drawingml/2006/main" xmlns:pic="http://schemas.openxmlformats.org/drawingml/2006/picture">
+            <wp:extent cx="5303520" cy="2682835"/>
+            <wp:docPr id="7" name="Picture 7"/>
+            <wp:cNvGraphicFramePr>
+              <a:graphicFrameLocks noChangeAspect="1"/>
+            </wp:cNvGraphicFramePr>
+            <a:graphic>
+              <a:graphicData uri="http://schemas.openxmlformats.org/drawingml/2006/picture">
+                <pic:pic>
+                  <pic:nvPicPr>
+                    <pic:cNvPr id="0" name="ss_rules.png"/>
+                    <pic:cNvPicPr/>
+                  </pic:nvPicPr>
+                  <pic:blipFill>
+                    <a:blip r:embed="rId17"/>
+                    <a:stretch>
+                      <a:fillRect/>
+                    </a:stretch>
+                  </pic:blipFill>
+                  <pic:spPr>
+                    <a:xfrm>
+                      <a:off x="0" y="0"/>
+                      <a:ext cx="5303520" cy="2682835"/>
+                    </a:xfrm>
+                    <a:prstGeom prst="rect"/>
+                  </pic:spPr>
+                </pic:pic>
+              </a:graphicData>
+            </a:graphic>
+          </wp:inline>
+        </w:drawing>
+      </w:r>
+    </w:p>
+    <w:p>
+      <w:pPr>
+        <w:spacing w:before="40" w:after="240"/>
+        <w:jc w:val="center"/>
+      </w:pPr>
+      <w:r>
+        <w:rPr>
+          <w:b/>
+          <w:color w:val="000000"/>
+          <w:sz w:val="19"/>
+        </w:rPr>
+        <w:t>Fig 6 : Firewall Policy &amp; Dynamic Filtering Rules Engine (MySQL Persistent)</w:t>
+      </w:r>
+    </w:p>
+    <w:p>
+      <w:pPr>
+        <w:pStyle w:val="Heading2"/>
+      </w:pPr>
+      <w:r>
+        <w:t>4.6 Global IP Geolocation Threat Radar Map</w:t>
+      </w:r>
+    </w:p>
+    <w:p>
+      <w:pPr>
+        <w:spacing w:line="288" w:lineRule="auto" w:after="80"/>
+        <w:jc w:val="both"/>
+      </w:pPr>
+      <w:r>
+        <w:t>The Global IP Geolocation Threat Radar maps packet ingress origins onto a world map projection. Trajectory vectors radiate from geographic centers (e.g. Frankfurt, Beijing, Moscow, Mumbai) toward the protected server cluster. The view features origin flag badges, IP coordinates, and city-level geolocations. Figure 7 illustrates the global threat radar map.</w:t>
       </w:r>
     </w:p>
     <w:p>
@@ -3831,7 +4029,7 @@
         <w:drawing>
           <wp:inline xmlns:a="http://schemas.openxmlformats.org/drawingml/2006/main" xmlns:pic="http://schemas.openxmlformats.org/drawingml/2006/picture">
             <wp:extent cx="5303520" cy="1874877"/>
-            <wp:docPr id="6" name="Picture 6"/>
+            <wp:docPr id="8" name="Picture 8"/>
             <wp:cNvGraphicFramePr>
               <a:graphicFrameLocks noChangeAspect="1"/>
             </wp:cNvGraphicFramePr>
@@ -3839,11 +4037,11 @@
               <a:graphicData uri="http://schemas.openxmlformats.org/drawingml/2006/picture">
                 <pic:pic>
                   <pic:nvPicPr>
-                    <pic:cNvPr id="0" name="fig5_geomap.png"/>
+                    <pic:cNvPr id="0" name="ss_geomap.png"/>
                     <pic:cNvPicPr/>
                   </pic:nvPicPr>
                   <pic:blipFill>
-                    <a:blip r:embed="rId16"/>
+                    <a:blip r:embed="rId18"/>
                     <a:stretch>
                       <a:fillRect/>
                     </a:stretch>
@@ -3873,7 +4071,12 @@
           <w:color w:val="000000"/>
           <w:sz w:val="19"/>
         </w:rPr>
-        <w:t>Fig 5 : Global IP Geolocation Threat Radar Map &amp; Origins Inventory</w:t>
+        <w:t>Fig 7 : Global IP Geolocation Threat Radar Map &amp; Origins Inventory</w:t>
+      </w:r>
+    </w:p>
+    <w:p>
+      <w:r>
+        <w:br w:type="page"/>
       </w:r>
     </w:p>
     <w:p>
@@ -3881,7 +4084,16 @@
         <w:pStyle w:val="Heading2"/>
       </w:pPr>
       <w:r>
-        <w:t>4.5 Network Topology Mesh Graph (Interactive Draggable Nodes)</w:t>
+        <w:t>4.7 Live Adversary Attack Simulation Console &amp; Critical Alert Banner</w:t>
+      </w:r>
+    </w:p>
+    <w:p>
+      <w:pPr>
+        <w:spacing w:line="288" w:lineRule="auto" w:after="80"/>
+        <w:jc w:val="both"/>
+      </w:pPr>
+      <w:r>
+        <w:t>The integrated Adversary Attack Simulation Console allows security personnel to launch authentic cyber-threat vectors on demand—including high-velocity TCP SYN floods and port reconnaissance—surging traffic to over 50 packets per second to validate drop rule enforcement and trigger the top Critical Alert Banner. Figure 8 designates the slot for the active attack simulation console.</w:t>
       </w:r>
     </w:p>
     <w:tbl>
@@ -3921,7 +4133,7 @@
                 <w:color w:val="000000"/>
                 <w:sz w:val="19"/>
               </w:rPr>
-              <w:t>📷 [SCREENSHOT PLACEHOLDER: Network Topology Mesh Graph]</w:t>
+              <w:t>📷 [SCREENSHOT PLACEHOLDER: Active Attack Simulation Console &amp; Alert Banner]</w:t>
             </w:r>
           </w:p>
           <w:p>
@@ -3934,7 +4146,7 @@
                 <w:color w:val="475569"/>
                 <w:sz w:val="17"/>
               </w:rPr>
-              <w:t>Shows the Central Sentinel Core hub, connected attacker nodes (red dashed curves), allowed transit nodes (green curves), and internal LAN servers (Database, Web Server, Gateway).</w:t>
+              <w:t>Capture the Attack Simulation modal active with TCP SYN Flood (DDoS) running from 192.168.1.105 and top red Critical Threat Banner.</w:t>
             </w:r>
           </w:p>
         </w:tc>
@@ -3951,7 +4163,7 @@
           <w:color w:val="000000"/>
           <w:sz w:val="19"/>
         </w:rPr>
-        <w:t>Fig 6 : Interactive Network Topology Mesh Graph with Draggable Nodes</w:t>
+        <w:t>Fig 8 : Live Attack Simulation Console &amp; Critical Threat Banner</w:t>
       </w:r>
     </w:p>
     <w:p>
@@ -3959,7 +4171,16 @@
         <w:pStyle w:val="Heading2"/>
       </w:pPr>
       <w:r>
-        <w:t>4.6 Live Attack Simulation Console &amp; Critical Banner</w:t>
+        <w:t>4.8 Sentinel AI Analyst &amp; Forensic Copilot Drawer</w:t>
+      </w:r>
+    </w:p>
+    <w:p>
+      <w:pPr>
+        <w:spacing w:line="288" w:lineRule="auto" w:after="80"/>
+        <w:jc w:val="both"/>
+      </w:pPr>
+      <w:r>
+        <w:t>Operating as an interactive slide-out drawer, the Sentinel AI Analyst consumes live packet telemetry and IDS anomaly logs to perform automated conversational root-cause analysis (RCA), recommending tactical iptables mitigation rules executable with a single click. Figure 9 designates the slot for the Sentinel AI Analyst drawer.</w:t>
       </w:r>
     </w:p>
     <w:tbl>
@@ -3999,7 +4220,7 @@
                 <w:color w:val="000000"/>
                 <w:sz w:val="19"/>
               </w:rPr>
-              <w:t>📷 [SCREENSHOT PLACEHOLDER: Attack Simulation Console &amp; Threat Banner]</w:t>
+              <w:t>📷 [SCREENSHOT PLACEHOLDER: Sentinel AI Analyst Forensic Drawer]</w:t>
             </w:r>
           </w:p>
           <w:p>
@@ -4012,7 +4233,7 @@
                 <w:color w:val="475569"/>
                 <w:sz w:val="17"/>
               </w:rPr>
-              <w:t>Attack simulation modal executing a TCP SYN Flood DDoS from 192.168.1.105 with top red Critical Alert Banner.</w:t>
+              <w:t>Capture the Sentinel AI Analyst chat drawer displaying automated incident RCA (Root Cause Analysis) and 1-click 'Commit DROP Rule' action.</w:t>
             </w:r>
           </w:p>
         </w:tc>
@@ -4029,85 +4250,7 @@
           <w:color w:val="000000"/>
           <w:sz w:val="19"/>
         </w:rPr>
-        <w:t>Fig 7 : Live Attack Simulation Console &amp; Critical Threat Banner</w:t>
-      </w:r>
-    </w:p>
-    <w:p>
-      <w:pPr>
-        <w:pStyle w:val="Heading2"/>
-      </w:pPr>
-      <w:r>
-        <w:t>4.7 Sentinel AI Analyst &amp; Forensic Chatbot</w:t>
-      </w:r>
-    </w:p>
-    <w:tbl>
-      <w:tblPr>
-        <w:tblW w:type="auto" w:w="0"/>
-        <w:jc w:val="center"/>
-        <w:tblLook w:firstColumn="1" w:firstRow="1" w:lastColumn="0" w:lastRow="0" w:noHBand="0" w:noVBand="1" w:val="04A0"/>
-      </w:tblPr>
-      <w:tblGrid>
-        <w:gridCol w:w="9029"/>
-      </w:tblGrid>
-      <w:tr>
-        <w:tc>
-          <w:tcPr>
-            <w:tcW w:type="dxa" w:w="8928"/>
-            <w:shd w:fill="F8FAFC"/>
-            <w:tcMar>
-              <w:top w:w="140" w:type="dxa"/>
-              <w:bottom w:w="140" w:type="dxa"/>
-              <w:left w:w="180" w:type="dxa"/>
-              <w:right w:w="180" w:type="dxa"/>
-            </w:tcMar>
-            <w:tcBorders>
-              <w:top w:val="single" w:sz="6" w:space="0" w:color="94A3B8"/>
-              <w:left w:val="single" w:sz="18" w:space="0" w:color="475569"/>
-              <w:bottom w:val="single" w:sz="6" w:space="0" w:color="94A3B8"/>
-              <w:right w:val="single" w:sz="6" w:space="0" w:color="94A3B8"/>
-            </w:tcBorders>
-          </w:tcPr>
-          <w:p>
-            <w:pPr>
-              <w:spacing w:before="40" w:after="40"/>
-            </w:pPr>
-            <w:r>
-              <w:rPr>
-                <w:b/>
-                <w:color w:val="000000"/>
-                <w:sz w:val="19"/>
-              </w:rPr>
-              <w:t>📷 [SCREENSHOT PLACEHOLDER: Sentinel AI Analyst Forensic Copilot]</w:t>
-            </w:r>
-          </w:p>
-          <w:p>
-            <w:pPr>
-              <w:spacing w:before="0" w:after="40"/>
-            </w:pPr>
-            <w:r>
-              <w:rPr>
-                <w:i/>
-                <w:color w:val="475569"/>
-                <w:sz w:val="17"/>
-              </w:rPr>
-              <w:t>Interactive forensic chat drawer with root-cause explanations and 1-click 'Commit DROP Rule' buttons.</w:t>
-            </w:r>
-          </w:p>
-        </w:tc>
-      </w:tr>
-    </w:tbl>
-    <w:p>
-      <w:pPr>
-        <w:spacing w:before="60" w:after="200"/>
-        <w:jc w:val="center"/>
-      </w:pPr>
-      <w:r>
-        <w:rPr>
-          <w:b/>
-          <w:color w:val="000000"/>
-          <w:sz w:val="19"/>
-        </w:rPr>
-        <w:t>Fig 8 : Sentinel AI Analyst Interactive Forensic Chatbot</w:t>
+        <w:t>Fig 9 : Sentinel AI Analyst Interactive Forensic Chatbot Drawer</w:t>
       </w:r>
     </w:p>
     <w:p>

</xml_diff>

<commit_message>
docs(report): update department to IT (TY A-16), embed high-res screenshots, and add MySQL database schema section
</commit_message>
<xml_diff>
--- a/Reports/Sentinel_Firewall_Project_Report.docx
+++ b/Reports/Sentinel_Firewall_Project_Report.docx
@@ -78,6 +78,8 @@
           <w:color w:val="000000"/>
           <w:sz w:val="24"/>
         </w:rPr>
+        <w:t>Department of Information Technology</w:t>
+        <w:br/>
         <w:t>Minor Degree in Cyber Security</w:t>
         <w:br/>
         <w:t>TAE-2</w:t>
@@ -88,7 +90,7 @@
     </w:p>
     <w:p>
       <w:pPr>
-        <w:spacing w:before="400" w:after="400"/>
+        <w:spacing w:before="360" w:after="360"/>
         <w:jc w:val="center"/>
       </w:pPr>
       <w:r>
@@ -112,7 +114,7 @@
     </w:p>
     <w:p>
       <w:pPr>
-        <w:spacing w:before="280" w:after="360"/>
+        <w:spacing w:before="240" w:after="320"/>
         <w:jc w:val="center"/>
       </w:pPr>
       <w:r>
@@ -147,13 +149,13 @@
           <w:color w:val="000000"/>
           <w:sz w:val="28"/>
         </w:rPr>
-        <w:t>AMMAR RAISAHMAD MULLA</w:t>
+        <w:t>AMMAR RAISAHMAD MULLA (TY A-16)</w:t>
         <w:br/>
       </w:r>
     </w:p>
     <w:p>
       <w:pPr>
-        <w:spacing w:before="440" w:after="0"/>
+        <w:spacing w:before="400" w:after="0"/>
         <w:jc w:val="center"/>
       </w:pPr>
       <w:r>
@@ -161,6 +163,8 @@
           <w:b/>
           <w:sz w:val="22"/>
         </w:rPr>
+        <w:t>Third Year B. Tech. (Information Technology)</w:t>
+        <w:br/>
         <w:t>Academic Year 2026-27</w:t>
         <w:br/>
         <w:t>Semester-V</w:t>
@@ -206,7 +210,7 @@
         <w:rPr>
           <w:b/>
         </w:rPr>
-        <w:t>AMMAR RAISAHMAD MULLA</w:t>
+        <w:t>AMMAR RAISAHMAD MULLA (TY A-16)</w:t>
       </w:r>
       <w:r>
         <w:t xml:space="preserve"> as a partial fulfilment of the requirement of TAE-2 for the subject </w:t>
@@ -218,7 +222,7 @@
         <w:t>Fundamental of Cyber Security &amp; Cryptography</w:t>
       </w:r>
       <w:r>
-        <w:t xml:space="preserve"> under the Minor Degree in Cyber Security, Third Year B. Tech., Semester V, during the academic year 2026-2027.</w:t>
+        <w:t xml:space="preserve"> under the Minor Degree in Cyber Security, Third Year B. Tech. (Department of Information Technology), Semester V, during the academic year 2026-2027.</w:t>
       </w:r>
     </w:p>
     <w:p>
@@ -278,7 +282,7 @@
               <w:br/>
             </w:r>
             <w:r>
-              <w:t>Head of Department</w:t>
+              <w:t>Head of Department (IT)</w:t>
             </w:r>
           </w:p>
         </w:tc>
@@ -345,7 +349,7 @@
         <w:t>Mrs. Sarita Patil</w:t>
       </w:r>
       <w:r>
-        <w:t>, Head of the Department of Computer Engineering, for providing the necessary computing facilities, laboratory infrastructure, and an inspiring academic environment. I also extend my thanks to all staff members of the Department of Computer Engineering for their cooperation whenever required.</w:t>
+        <w:t>, Head of the Department of Information Technology, for providing the necessary computing facilities, laboratory infrastructure, and an inspiring academic environment. I also extend my thanks to all staff members of the Department of Information Technology for their cooperation whenever required.</w:t>
       </w:r>
     </w:p>
     <w:p>
@@ -368,9 +372,9 @@
         </w:rPr>
         <w:t>AMMAR RAISAHMAD MULLA</w:t>
         <w:br/>
-        <w:t>Third Year B. Tech. (Cyber Security Minor)</w:t>
+        <w:t>Third Year B. Tech. (Information Technology, TY A-16)</w:t>
         <w:br/>
-        <w:t>Department of Computer Engineering</w:t>
+        <w:t>Department of Information Technology</w:t>
       </w:r>
     </w:p>
     <w:p>
@@ -806,7 +810,7 @@
                 <w:color w:val="000000"/>
                 <w:sz w:val="18"/>
               </w:rPr>
-              <w:t>5</w:t>
+              <w:t>3</w:t>
             </w:r>
           </w:p>
         </w:tc>
@@ -907,7 +911,7 @@
                 <w:color w:val="000000"/>
                 <w:sz w:val="18"/>
               </w:rPr>
-              <w:t>7</w:t>
+              <w:t>4</w:t>
             </w:r>
           </w:p>
         </w:tc>
@@ -976,7 +980,7 @@
                 <w:color w:val="000000"/>
                 <w:sz w:val="18"/>
               </w:rPr>
-              <w:t>Algorithms &amp; Working Mechanism</w:t>
+              <w:t>Algorithms, Mathematical Models &amp; Database Architecture</w:t>
             </w:r>
           </w:p>
         </w:tc>
@@ -1008,7 +1012,7 @@
                 <w:color w:val="000000"/>
                 <w:sz w:val="18"/>
               </w:rPr>
-              <w:t>11</w:t>
+              <w:t>12</w:t>
             </w:r>
           </w:p>
         </w:tc>
@@ -1210,7 +1214,7 @@
                 <w:color w:val="000000"/>
                 <w:sz w:val="18"/>
               </w:rPr>
-              <w:t>15</w:t>
+              <w:t>14</w:t>
             </w:r>
           </w:p>
         </w:tc>
@@ -1311,7 +1315,7 @@
                 <w:color w:val="000000"/>
                 <w:sz w:val="18"/>
               </w:rPr>
-              <w:t>18</w:t>
+              <w:t>15</w:t>
             </w:r>
           </w:p>
         </w:tc>
@@ -1412,7 +1416,7 @@
                 <w:color w:val="000000"/>
                 <w:sz w:val="18"/>
               </w:rPr>
-              <w:t>19</w:t>
+              <w:t>15</w:t>
             </w:r>
           </w:p>
         </w:tc>
@@ -3861,7 +3865,7 @@
         <w:pStyle w:val="Heading2"/>
       </w:pPr>
       <w:r>
-        <w:t>4.4 Heuristic Intrusion Detection System (IDS) Engine &amp; Live Threat Feed</w:t>
+        <w:t>4.4 Heuristic Intrusion Detection System (IDS) Engine &amp; Threat Feed</w:t>
       </w:r>
     </w:p>
     <w:p>
@@ -3870,7 +3874,7 @@
         <w:jc w:val="both"/>
       </w:pPr>
       <w:r>
-        <w:t>The Intrusion Detection System inspects incoming traffic against known adversarial patterns, such as TCP SYN Floods (MITRE ATT&amp;CK T1498.001), horizontal port sweeps, and SSH/RDP brute force attempts. The threat intelligence console ranks alerts by severity, tallies frequency histograms, and provides 1-click 'Auto-Block IP' controls that immediately commit dynamic DROP rules to the policy engine. Figure 5 depicts the IDS threat intelligence console.</w:t>
+        <w:t>The Intrusion Detection System inspects incoming traffic against known adversarial patterns, such as TCP SYN Floods (MITRE ATT&amp;CK T1498.001), horizontal port sweeps, and DNS amplification reflection vectors. The threat intelligence console ranks alerts by severity, tracks containment status (Contained vs Uncontained), and provides 1-click 'Auto-Block IP' controls that immediately commit dynamic DROP rules to the policy engine. Figure 5 depicts the live threat intelligence feed.</w:t>
       </w:r>
     </w:p>
     <w:p>
@@ -3890,7 +3894,7 @@
               <a:graphicData uri="http://schemas.openxmlformats.org/drawingml/2006/picture">
                 <pic:pic>
                   <pic:nvPicPr>
-                    <pic:cNvPr id="0" name="ss_ids.png"/>
+                    <pic:cNvPr id="0" name="ss_ids_feed.png"/>
                     <pic:cNvPicPr/>
                   </pic:nvPicPr>
                   <pic:blipFill>
@@ -4004,11 +4008,16 @@
       </w:r>
     </w:p>
     <w:p>
+      <w:r>
+        <w:br w:type="page"/>
+      </w:r>
+    </w:p>
+    <w:p>
       <w:pPr>
         <w:pStyle w:val="Heading2"/>
       </w:pPr>
       <w:r>
-        <w:t>4.6 Global IP Geolocation Threat Radar Map</w:t>
+        <w:t>4.6 Geopolitical Cyber Radar: Live Global Attack Origin Map</w:t>
       </w:r>
     </w:p>
     <w:p>
@@ -4017,7 +4026,7 @@
         <w:jc w:val="both"/>
       </w:pPr>
       <w:r>
-        <w:t>The Global IP Geolocation Threat Radar maps packet ingress origins onto a world map projection. Trajectory vectors radiate from geographic centers (e.g. Frankfurt, Beijing, Moscow, Mumbai) toward the protected server cluster. The view features origin flag badges, IP coordinates, and city-level geolocations. Figure 7 illustrates the global threat radar map.</w:t>
+        <w:t>The Geopolitical Cyber Radar maps packet ingress origins onto a tactical world map projection. Trajectory vectors radiate from geographic centers (e.g. Frankfurt, London, Moscow, Paris, Ashburn) toward the protected server cluster. The view features sweep radar concentric circles, threat category color coding, and node status indicators. Figure 7 illustrates the global threat radar map.</w:t>
       </w:r>
     </w:p>
     <w:p>
@@ -4028,7 +4037,7 @@
       <w:r>
         <w:drawing>
           <wp:inline xmlns:a="http://schemas.openxmlformats.org/drawingml/2006/main" xmlns:pic="http://schemas.openxmlformats.org/drawingml/2006/picture">
-            <wp:extent cx="5303520" cy="1874877"/>
+            <wp:extent cx="5303520" cy="2413516"/>
             <wp:docPr id="8" name="Picture 8"/>
             <wp:cNvGraphicFramePr>
               <a:graphicFrameLocks noChangeAspect="1"/>
@@ -4037,7 +4046,7 @@
               <a:graphicData uri="http://schemas.openxmlformats.org/drawingml/2006/picture">
                 <pic:pic>
                   <pic:nvPicPr>
-                    <pic:cNvPr id="0" name="ss_geomap.png"/>
+                    <pic:cNvPr id="0" name="ss_geomap_radar.png"/>
                     <pic:cNvPicPr/>
                   </pic:nvPicPr>
                   <pic:blipFill>
@@ -4049,7 +4058,7 @@
                   <pic:spPr>
                     <a:xfrm>
                       <a:off x="0" y="0"/>
-                      <a:ext cx="5303520" cy="1874877"/>
+                      <a:ext cx="5303520" cy="2413516"/>
                     </a:xfrm>
                     <a:prstGeom prst="rect"/>
                   </pic:spPr>
@@ -4071,7 +4080,7 @@
           <w:color w:val="000000"/>
           <w:sz w:val="19"/>
         </w:rPr>
-        <w:t>Fig 7 : Global IP Geolocation Threat Radar Map &amp; Origins Inventory</w:t>
+        <w:t>Fig 7 : Geopolitical Cyber Radar: Live Global Attack Origin Map</w:t>
       </w:r>
     </w:p>
     <w:p>
@@ -4084,7 +4093,7 @@
         <w:pStyle w:val="Heading2"/>
       </w:pPr>
       <w:r>
-        <w:t>4.7 Live Adversary Attack Simulation Console &amp; Critical Alert Banner</w:t>
+        <w:t>4.7 Geolocated Ingress Nodes &amp; Threat Origins Inventory Table</w:t>
       </w:r>
     </w:p>
     <w:p>
@@ -4093,7 +4102,154 @@
         <w:jc w:val="both"/>
       </w:pPr>
       <w:r>
-        <w:t>The integrated Adversary Attack Simulation Console allows security personnel to launch authentic cyber-threat vectors on demand—including high-velocity TCP SYN floods and port reconnaissance—surging traffic to over 50 packets per second to validate drop rule enforcement and trigger the top Critical Alert Banner. Figure 8 designates the slot for the active attack simulation console.</w:t>
+        <w:t>Complementing the radar visualization, the Geolocated Ingress Nodes Inventory aggregates origin IPs into an actionable SOC inventory table. Each entry specifies Autonomous System Numbers (ASN / ISP), geographical coordinates, threat score assessment (Critical 98 to Low 18), cumulative packet volume, and 1-click 'Drop IP' defense mitigations. Figure 8 displays the geolocated origins table.</w:t>
+      </w:r>
+    </w:p>
+    <w:p>
+      <w:pPr>
+        <w:spacing w:before="120" w:after="80"/>
+        <w:jc w:val="center"/>
+      </w:pPr>
+      <w:r>
+        <w:drawing>
+          <wp:inline xmlns:a="http://schemas.openxmlformats.org/drawingml/2006/main" xmlns:pic="http://schemas.openxmlformats.org/drawingml/2006/picture">
+            <wp:extent cx="5303520" cy="3045380"/>
+            <wp:docPr id="9" name="Picture 9"/>
+            <wp:cNvGraphicFramePr>
+              <a:graphicFrameLocks noChangeAspect="1"/>
+            </wp:cNvGraphicFramePr>
+            <a:graphic>
+              <a:graphicData uri="http://schemas.openxmlformats.org/drawingml/2006/picture">
+                <pic:pic>
+                  <pic:nvPicPr>
+                    <pic:cNvPr id="0" name="ss_geomap_origins.png"/>
+                    <pic:cNvPicPr/>
+                  </pic:nvPicPr>
+                  <pic:blipFill>
+                    <a:blip r:embed="rId19"/>
+                    <a:stretch>
+                      <a:fillRect/>
+                    </a:stretch>
+                  </pic:blipFill>
+                  <pic:spPr>
+                    <a:xfrm>
+                      <a:off x="0" y="0"/>
+                      <a:ext cx="5303520" cy="3045380"/>
+                    </a:xfrm>
+                    <a:prstGeom prst="rect"/>
+                  </pic:spPr>
+                </pic:pic>
+              </a:graphicData>
+            </a:graphic>
+          </wp:inline>
+        </w:drawing>
+      </w:r>
+    </w:p>
+    <w:p>
+      <w:pPr>
+        <w:spacing w:before="40" w:after="240"/>
+        <w:jc w:val="center"/>
+      </w:pPr>
+      <w:r>
+        <w:rPr>
+          <w:b/>
+          <w:color w:val="000000"/>
+          <w:sz w:val="19"/>
+        </w:rPr>
+        <w:t>Fig 8 : Geolocated Ingress Nodes &amp; Threat Origins Inventory Table</w:t>
+      </w:r>
+    </w:p>
+    <w:p>
+      <w:r>
+        <w:br w:type="page"/>
+      </w:r>
+    </w:p>
+    <w:p>
+      <w:pPr>
+        <w:pStyle w:val="Heading2"/>
+      </w:pPr>
+      <w:r>
+        <w:t>4.8 Sentinel AI Copilot Autonomous Forensic Reasoning Drawer</w:t>
+      </w:r>
+    </w:p>
+    <w:p>
+      <w:pPr>
+        <w:spacing w:line="288" w:lineRule="auto" w:after="80"/>
+        <w:jc w:val="both"/>
+      </w:pPr>
+      <w:r>
+        <w:t>Integrated directly into the interface as an interactive slide-out drawer, the Sentinel AI Copilot leverages large language models (Google Gemini LLM) to execute wire-speed forensic telemetry assessment. The Copilot analyzes flagged attacker IPs, determines root-cause MITRE ATT&amp;CK vectors, computes socket velocity (~480 frames/sec), and provides 1-click 'Generate iptables rules' actions. Figure 9 showcases the AI Copilot forensic analysis interface.</w:t>
+      </w:r>
+    </w:p>
+    <w:p>
+      <w:pPr>
+        <w:spacing w:before="120" w:after="80"/>
+        <w:jc w:val="center"/>
+      </w:pPr>
+      <w:r>
+        <w:drawing>
+          <wp:inline xmlns:a="http://schemas.openxmlformats.org/drawingml/2006/main" xmlns:pic="http://schemas.openxmlformats.org/drawingml/2006/picture">
+            <wp:extent cx="3017520" cy="4860363"/>
+            <wp:docPr id="10" name="Picture 10"/>
+            <wp:cNvGraphicFramePr>
+              <a:graphicFrameLocks noChangeAspect="1"/>
+            </wp:cNvGraphicFramePr>
+            <a:graphic>
+              <a:graphicData uri="http://schemas.openxmlformats.org/drawingml/2006/picture">
+                <pic:pic>
+                  <pic:nvPicPr>
+                    <pic:cNvPr id="0" name="ss_ai_copilot.png"/>
+                    <pic:cNvPicPr/>
+                  </pic:nvPicPr>
+                  <pic:blipFill>
+                    <a:blip r:embed="rId20"/>
+                    <a:stretch>
+                      <a:fillRect/>
+                    </a:stretch>
+                  </pic:blipFill>
+                  <pic:spPr>
+                    <a:xfrm>
+                      <a:off x="0" y="0"/>
+                      <a:ext cx="3017520" cy="4860363"/>
+                    </a:xfrm>
+                    <a:prstGeom prst="rect"/>
+                  </pic:spPr>
+                </pic:pic>
+              </a:graphicData>
+            </a:graphic>
+          </wp:inline>
+        </w:drawing>
+      </w:r>
+    </w:p>
+    <w:p>
+      <w:pPr>
+        <w:spacing w:before="40" w:after="240"/>
+        <w:jc w:val="center"/>
+      </w:pPr>
+      <w:r>
+        <w:rPr>
+          <w:b/>
+          <w:color w:val="000000"/>
+          <w:sz w:val="19"/>
+        </w:rPr>
+        <w:t>Fig 9 : Sentinel AI Copilot Autonomous Forensic Reasoning &amp; Remediation Drawer</w:t>
+      </w:r>
+    </w:p>
+    <w:p>
+      <w:pPr>
+        <w:pStyle w:val="Heading2"/>
+      </w:pPr>
+      <w:r>
+        <w:t>4.9 Live Adversary Attack Simulation Console &amp; Critical Alert Banner</w:t>
+      </w:r>
+    </w:p>
+    <w:p>
+      <w:pPr>
+        <w:spacing w:line="288" w:lineRule="auto" w:after="80"/>
+        <w:jc w:val="both"/>
+      </w:pPr>
+      <w:r>
+        <w:t>The integrated Adversary Attack Simulation Console allows security personnel to launch authentic cyber-threat vectors on demand—including high-velocity TCP SYN floods and port reconnaissance—surging traffic to over 50 packets per second to validate drop rule enforcement and trigger the top Critical Alert Banner. Figure 10 designates the reference slot for the active attack simulation modal.</w:t>
       </w:r>
     </w:p>
     <w:tbl>
@@ -4163,94 +4319,7 @@
           <w:color w:val="000000"/>
           <w:sz w:val="19"/>
         </w:rPr>
-        <w:t>Fig 8 : Live Attack Simulation Console &amp; Critical Threat Banner</w:t>
-      </w:r>
-    </w:p>
-    <w:p>
-      <w:pPr>
-        <w:pStyle w:val="Heading2"/>
-      </w:pPr>
-      <w:r>
-        <w:t>4.8 Sentinel AI Analyst &amp; Forensic Copilot Drawer</w:t>
-      </w:r>
-    </w:p>
-    <w:p>
-      <w:pPr>
-        <w:spacing w:line="288" w:lineRule="auto" w:after="80"/>
-        <w:jc w:val="both"/>
-      </w:pPr>
-      <w:r>
-        <w:t>Operating as an interactive slide-out drawer, the Sentinel AI Analyst consumes live packet telemetry and IDS anomaly logs to perform automated conversational root-cause analysis (RCA), recommending tactical iptables mitigation rules executable with a single click. Figure 9 designates the slot for the Sentinel AI Analyst drawer.</w:t>
-      </w:r>
-    </w:p>
-    <w:tbl>
-      <w:tblPr>
-        <w:tblW w:type="auto" w:w="0"/>
-        <w:jc w:val="center"/>
-        <w:tblLook w:firstColumn="1" w:firstRow="1" w:lastColumn="0" w:lastRow="0" w:noHBand="0" w:noVBand="1" w:val="04A0"/>
-      </w:tblPr>
-      <w:tblGrid>
-        <w:gridCol w:w="9029"/>
-      </w:tblGrid>
-      <w:tr>
-        <w:tc>
-          <w:tcPr>
-            <w:tcW w:type="dxa" w:w="8928"/>
-            <w:shd w:fill="F8FAFC"/>
-            <w:tcMar>
-              <w:top w:w="140" w:type="dxa"/>
-              <w:bottom w:w="140" w:type="dxa"/>
-              <w:left w:w="180" w:type="dxa"/>
-              <w:right w:w="180" w:type="dxa"/>
-            </w:tcMar>
-            <w:tcBorders>
-              <w:top w:val="single" w:sz="6" w:space="0" w:color="94A3B8"/>
-              <w:left w:val="single" w:sz="18" w:space="0" w:color="475569"/>
-              <w:bottom w:val="single" w:sz="6" w:space="0" w:color="94A3B8"/>
-              <w:right w:val="single" w:sz="6" w:space="0" w:color="94A3B8"/>
-            </w:tcBorders>
-          </w:tcPr>
-          <w:p>
-            <w:pPr>
-              <w:spacing w:before="40" w:after="40"/>
-            </w:pPr>
-            <w:r>
-              <w:rPr>
-                <w:b/>
-                <w:color w:val="000000"/>
-                <w:sz w:val="19"/>
-              </w:rPr>
-              <w:t>📷 [SCREENSHOT PLACEHOLDER: Sentinel AI Analyst Forensic Drawer]</w:t>
-            </w:r>
-          </w:p>
-          <w:p>
-            <w:pPr>
-              <w:spacing w:before="0" w:after="40"/>
-            </w:pPr>
-            <w:r>
-              <w:rPr>
-                <w:i/>
-                <w:color w:val="475569"/>
-                <w:sz w:val="17"/>
-              </w:rPr>
-              <w:t>Capture the Sentinel AI Analyst chat drawer displaying automated incident RCA (Root Cause Analysis) and 1-click 'Commit DROP Rule' action.</w:t>
-            </w:r>
-          </w:p>
-        </w:tc>
-      </w:tr>
-    </w:tbl>
-    <w:p>
-      <w:pPr>
-        <w:spacing w:before="60" w:after="200"/>
-        <w:jc w:val="center"/>
-      </w:pPr>
-      <w:r>
-        <w:rPr>
-          <w:b/>
-          <w:color w:val="000000"/>
-          <w:sz w:val="19"/>
-        </w:rPr>
-        <w:t>Fig 9 : Sentinel AI Analyst Interactive Forensic Chatbot Drawer</w:t>
+        <w:t>Fig 10 : Live Adversary Attack Simulation Console &amp; Critical Alert Banner</w:t>
       </w:r>
     </w:p>
     <w:p>
@@ -4376,6 +4445,114 @@
         <w:t xml:space="preserve">    if packet.dstPort in [22, 3389] and packet.rate &gt; THRESHOLD:</w:t>
         <w:br/>
         <w:t xml:space="preserve">        return createAlert('Credential Brute-Force', 'ET-AUTH-PROBE', 'HIGH')</w:t>
+      </w:r>
+    </w:p>
+    <w:p>
+      <w:pPr>
+        <w:pStyle w:val="Heading2"/>
+      </w:pPr>
+      <w:r>
+        <w:t>5.4 Relational Database Architecture &amp; MySQL Persistence Implementation</w:t>
+      </w:r>
+    </w:p>
+    <w:p>
+      <w:pPr>
+        <w:spacing w:line="288" w:lineRule="auto" w:after="120"/>
+        <w:jc w:val="both"/>
+      </w:pPr>
+      <w:r>
+        <w:t>To guarantee stateful rule survival, audit compliance, and multi-session consistency across server reboots, Sentinel persists all policy records and packet accounting metrics within a relational MySQL database ('firewall_db'). Ingress packets matched against netfilter chains execute asynchronous updates against active rule counters (hits and byte tallies) without introducing kernel packet-processing bottlenecks. The complete production MySQL DDL schema and operational queries implemented in the Sentinel backend are specified below:</w:t>
+      </w:r>
+    </w:p>
+    <w:p>
+      <w:pPr>
+        <w:spacing w:before="80" w:after="240"/>
+      </w:pPr>
+      <w:r>
+        <w:rPr>
+          <w:rFonts w:ascii="Consolas" w:hAnsi="Consolas"/>
+          <w:color w:val="000000"/>
+          <w:sz w:val="16"/>
+        </w:rPr>
+        <w:t>-- =============================================================</w:t>
+        <w:br/>
+        <w:t>-- Sentinel Firewall &amp; IDS: Relational Database Schema (MySQL)</w:t>
+        <w:br/>
+        <w:t>-- Database: firewall_db | Engine: InnoDB | Charset: utf8mb4</w:t>
+        <w:br/>
+        <w:t>-- =============================================================</w:t>
+        <w:br/>
+        <w:br/>
+        <w:t>CREATE DATABASE IF NOT EXISTS firewall_db;</w:t>
+        <w:br/>
+        <w:t>USE firewall_db;</w:t>
+        <w:br/>
+        <w:br/>
+        <w:t>-- 1. Netfilter Policy Enforcement Rules Table</w:t>
+        <w:br/>
+        <w:t>CREATE TABLE IF NOT EXISTS firewall_rules (</w:t>
+        <w:br/>
+        <w:t xml:space="preserve">    id INT AUTO_INCREMENT PRIMARY KEY,</w:t>
+        <w:br/>
+        <w:t xml:space="preserve">    target_ip VARCHAR(50) NOT NULL COMMENT 'Target IPv4/CIDR or ANY',</w:t>
+        <w:br/>
+        <w:t xml:space="preserve">    port VARCHAR(20) NOT NULL COMMENT 'Target Port or ALL',</w:t>
+        <w:br/>
+        <w:t xml:space="preserve">    protocol VARCHAR(10) DEFAULT 'TCP' COMMENT 'TCP / UDP / ICMP',</w:t>
+        <w:br/>
+        <w:t xml:space="preserve">    action ENUM('ALLOW', 'DROP') NOT NULL COMMENT 'Policy Verdict',</w:t>
+        <w:br/>
+        <w:t xml:space="preserve">    description VARCHAR(255) DEFAULT '',</w:t>
+        <w:br/>
+        <w:t xml:space="preserve">    hits INT DEFAULT 0 COMMENT 'Live Rule Match Counter',</w:t>
+        <w:br/>
+        <w:t xml:space="preserve">    bytes VARCHAR(50) DEFAULT '0 B' COMMENT 'Cumulative Bandwidth',</w:t>
+        <w:br/>
+        <w:t xml:space="preserve">    status VARCHAR(20) DEFAULT 'ACTIVE',</w:t>
+        <w:br/>
+        <w:t xml:space="preserve">    created_at TIMESTAMP DEFAULT CURRENT_TIMESTAMP</w:t>
+        <w:br/>
+        <w:t>) ENGINE=InnoDB DEFAULT CHARSET=utf8mb4;</w:t>
+        <w:br/>
+        <w:br/>
+        <w:t>-- 2. Security Audit &amp; Ingress Packet Accounting Table</w:t>
+        <w:br/>
+        <w:t>CREATE TABLE IF NOT EXISTS firewall_logs (</w:t>
+        <w:br/>
+        <w:t xml:space="preserve">    id INT AUTO_INCREMENT PRIMARY KEY,</w:t>
+        <w:br/>
+        <w:t xml:space="preserve">    time VARCHAR(30) NOT NULL COMMENT 'ISO Timestamp',</w:t>
+        <w:br/>
+        <w:t xml:space="preserve">    proto VARCHAR(30) NOT NULL COMMENT 'Transport Protocol',</w:t>
+        <w:br/>
+        <w:t xml:space="preserve">    src_ip VARCHAR(50) NOT NULL COMMENT 'Source IP Address',</w:t>
+        <w:br/>
+        <w:t xml:space="preserve">    src_port INT COMMENT 'Source Port',</w:t>
+        <w:br/>
+        <w:t xml:space="preserve">    dst_ip VARCHAR(50) NOT NULL COMMENT 'Destination IP Address',</w:t>
+        <w:br/>
+        <w:t xml:space="preserve">    dst_port INT COMMENT 'Destination Port',</w:t>
+        <w:br/>
+        <w:t xml:space="preserve">    len INT COMMENT 'Payload Length (Bytes)',</w:t>
+        <w:br/>
+        <w:t xml:space="preserve">    action ENUM('ALLOW', 'DROP') NOT NULL,</w:t>
+        <w:br/>
+        <w:t xml:space="preserve">    rule_id VARCHAR(50) COMMENT 'Matched Policy Rule ID',</w:t>
+        <w:br/>
+        <w:t xml:space="preserve">    created_at TIMESTAMP DEFAULT CURRENT_TIMESTAMP</w:t>
+        <w:br/>
+        <w:t>) ENGINE=InnoDB DEFAULT CHARSET=utf8mb4;</w:t>
+        <w:br/>
+        <w:br/>
+        <w:t>-- 3. Asynchronous Packet Match Hit &amp; Byte Counter Incrementation</w:t>
+        <w:br/>
+        <w:t xml:space="preserve">UPDATE firewall_rules </w:t>
+        <w:br/>
+        <w:t xml:space="preserve">SET hits = hits + 1, </w:t>
+        <w:br/>
+        <w:t xml:space="preserve">    bytes = CONCAT(ROUND(CAST(SUBSTRING_INDEX(bytes, ' ', 1) AS DECIMAL(10,2)) + (? / 1024), 2), ' KB')</w:t>
+        <w:br/>
+        <w:t>WHERE id = ?;</w:t>
       </w:r>
     </w:p>
     <w:p>

</xml_diff>

<commit_message>
docs(report): update department to Information Technology TY A-16, embed high-res AI copilot and geo origins screenshots, and add MySQL database schema section
</commit_message>
<xml_diff>
--- a/Reports/Sentinel_Firewall_Project_Report.docx
+++ b/Reports/Sentinel_Firewall_Project_Report.docx
@@ -90,7 +90,7 @@
     </w:p>
     <w:p>
       <w:pPr>
-        <w:spacing w:before="360" w:after="360"/>
+        <w:spacing w:before="400" w:after="400"/>
         <w:jc w:val="center"/>
       </w:pPr>
       <w:r>
@@ -114,7 +114,7 @@
     </w:p>
     <w:p>
       <w:pPr>
-        <w:spacing w:before="240" w:after="320"/>
+        <w:spacing w:before="280" w:after="360"/>
         <w:jc w:val="center"/>
       </w:pPr>
       <w:r>
@@ -147,15 +147,19 @@
         <w:rPr>
           <w:b/>
           <w:color w:val="000000"/>
-          <w:sz w:val="28"/>
+          <w:sz w:val="27"/>
         </w:rPr>
-        <w:t>AMMAR RAISAHMAD MULLA (TY A-16)</w:t>
+        <w:t>AMMAR RAISAHMAD MULLA</w:t>
+        <w:br/>
+        <w:t>Class: TY A-16 | Roll No: 16</w:t>
+        <w:br/>
+        <w:t>Department of Information Technology</w:t>
         <w:br/>
       </w:r>
     </w:p>
     <w:p>
       <w:pPr>
-        <w:spacing w:before="400" w:after="0"/>
+        <w:spacing w:before="440" w:after="0"/>
         <w:jc w:val="center"/>
       </w:pPr>
       <w:r>
@@ -163,8 +167,6 @@
           <w:b/>
           <w:sz w:val="22"/>
         </w:rPr>
-        <w:t>Third Year B. Tech. (Information Technology)</w:t>
-        <w:br/>
         <w:t>Academic Year 2026-27</w:t>
         <w:br/>
         <w:t>Semester-V</w:t>
@@ -210,7 +212,7 @@
         <w:rPr>
           <w:b/>
         </w:rPr>
-        <w:t>AMMAR RAISAHMAD MULLA (TY A-16)</w:t>
+        <w:t>AMMAR RAISAHMAD MULLA (Class: TY A-16)</w:t>
       </w:r>
       <w:r>
         <w:t xml:space="preserve"> as a partial fulfilment of the requirement of TAE-2 for the subject </w:t>
@@ -222,7 +224,7 @@
         <w:t>Fundamental of Cyber Security &amp; Cryptography</w:t>
       </w:r>
       <w:r>
-        <w:t xml:space="preserve"> under the Minor Degree in Cyber Security, Third Year B. Tech. (Department of Information Technology), Semester V, during the academic year 2026-2027.</w:t>
+        <w:t xml:space="preserve"> under the Department of Information Technology (Minor Degree in Cyber Security), Third Year B. Tech., Semester V, during the academic year 2026-2027.</w:t>
       </w:r>
     </w:p>
     <w:p>
@@ -282,7 +284,7 @@
               <w:br/>
             </w:r>
             <w:r>
-              <w:t>Head of Department (IT)</w:t>
+              <w:t>Head, Department of Information Technology</w:t>
             </w:r>
           </w:p>
         </w:tc>
@@ -372,7 +374,7 @@
         </w:rPr>
         <w:t>AMMAR RAISAHMAD MULLA</w:t>
         <w:br/>
-        <w:t>Third Year B. Tech. (Information Technology, TY A-16)</w:t>
+        <w:t>Third Year B. Tech. (Information Technology - TY A-16)</w:t>
         <w:br/>
         <w:t>Department of Information Technology</w:t>
       </w:r>
@@ -810,7 +812,7 @@
                 <w:color w:val="000000"/>
                 <w:sz w:val="18"/>
               </w:rPr>
-              <w:t>3</w:t>
+              <w:t>4</w:t>
             </w:r>
           </w:p>
         </w:tc>
@@ -911,7 +913,7 @@
                 <w:color w:val="000000"/>
                 <w:sz w:val="18"/>
               </w:rPr>
-              <w:t>4</w:t>
+              <w:t>5</w:t>
             </w:r>
           </w:p>
         </w:tc>
@@ -980,7 +982,7 @@
                 <w:color w:val="000000"/>
                 <w:sz w:val="18"/>
               </w:rPr>
-              <w:t>Algorithms, Mathematical Models &amp; Database Architecture</w:t>
+              <w:t>Algorithms &amp; Database Schema</w:t>
             </w:r>
           </w:p>
         </w:tc>
@@ -1012,7 +1014,7 @@
                 <w:color w:val="000000"/>
                 <w:sz w:val="18"/>
               </w:rPr>
-              <w:t>12</w:t>
+              <w:t>13</w:t>
             </w:r>
           </w:p>
         </w:tc>
@@ -1113,7 +1115,7 @@
                 <w:color w:val="000000"/>
                 <w:sz w:val="18"/>
               </w:rPr>
-              <w:t>13</w:t>
+              <w:t>14</w:t>
             </w:r>
           </w:p>
         </w:tc>
@@ -1214,7 +1216,7 @@
                 <w:color w:val="000000"/>
                 <w:sz w:val="18"/>
               </w:rPr>
-              <w:t>14</w:t>
+              <w:t>15</w:t>
             </w:r>
           </w:p>
         </w:tc>
@@ -1315,7 +1317,7 @@
                 <w:color w:val="000000"/>
                 <w:sz w:val="18"/>
               </w:rPr>
-              <w:t>15</w:t>
+              <w:t>16</w:t>
             </w:r>
           </w:p>
         </w:tc>
@@ -1416,7 +1418,7 @@
                 <w:color w:val="000000"/>
                 <w:sz w:val="18"/>
               </w:rPr>
-              <w:t>15</w:t>
+              <w:t>16</w:t>
             </w:r>
           </w:p>
         </w:tc>
@@ -3865,7 +3867,7 @@
         <w:pStyle w:val="Heading2"/>
       </w:pPr>
       <w:r>
-        <w:t>4.4 Heuristic Intrusion Detection System (IDS) Engine &amp; Threat Feed</w:t>
+        <w:t>4.4 Heuristic Intrusion Detection System (IDS) Engine &amp; Live Threat Feed</w:t>
       </w:r>
     </w:p>
     <w:p>
@@ -3874,7 +3876,7 @@
         <w:jc w:val="both"/>
       </w:pPr>
       <w:r>
-        <w:t>The Intrusion Detection System inspects incoming traffic against known adversarial patterns, such as TCP SYN Floods (MITRE ATT&amp;CK T1498.001), horizontal port sweeps, and DNS amplification reflection vectors. The threat intelligence console ranks alerts by severity, tracks containment status (Contained vs Uncontained), and provides 1-click 'Auto-Block IP' controls that immediately commit dynamic DROP rules to the policy engine. Figure 5 depicts the live threat intelligence feed.</w:t>
+        <w:t>The Intrusion Detection System inspects incoming traffic against known adversarial patterns, such as TCP SYN Floods (MITRE ATT&amp;CK T1498.001), horizontal port sweeps, and SSH/RDP brute force attempts. The threat intelligence console ranks alerts by severity, tallies frequency histograms, and provides 1-click 'Auto-Block IP' controls that immediately commit dynamic DROP rules to the policy engine. Figure 5 depicts the IDS threat intelligence console.</w:t>
       </w:r>
     </w:p>
     <w:p>
@@ -3894,7 +3896,7 @@
               <a:graphicData uri="http://schemas.openxmlformats.org/drawingml/2006/picture">
                 <pic:pic>
                   <pic:nvPicPr>
-                    <pic:cNvPr id="0" name="ss_ids_feed.png"/>
+                    <pic:cNvPr id="0" name="ss_ids.png"/>
                     <pic:cNvPicPr/>
                   </pic:nvPicPr>
                   <pic:blipFill>
@@ -4008,16 +4010,11 @@
       </w:r>
     </w:p>
     <w:p>
-      <w:r>
-        <w:br w:type="page"/>
-      </w:r>
-    </w:p>
-    <w:p>
       <w:pPr>
         <w:pStyle w:val="Heading2"/>
       </w:pPr>
       <w:r>
-        <w:t>4.6 Geopolitical Cyber Radar: Live Global Attack Origin Map</w:t>
+        <w:t>4.6 Global IP Geolocation Threat Radar Map</w:t>
       </w:r>
     </w:p>
     <w:p>
@@ -4026,7 +4023,7 @@
         <w:jc w:val="both"/>
       </w:pPr>
       <w:r>
-        <w:t>The Geopolitical Cyber Radar maps packet ingress origins onto a tactical world map projection. Trajectory vectors radiate from geographic centers (e.g. Frankfurt, London, Moscow, Paris, Ashburn) toward the protected server cluster. The view features sweep radar concentric circles, threat category color coding, and node status indicators. Figure 7 illustrates the global threat radar map.</w:t>
+        <w:t>The Global IP Geolocation Threat Radar maps packet ingress origins onto an interactive geopolitical world projection. High-velocity threat trajectories radiate from international epicenters (e.g. Frankfurt, Beijing, Moscow, Paris, Mumbai) toward the protected server cluster. Figure 7 illustrates the global cyber threat radar view.</w:t>
       </w:r>
     </w:p>
     <w:p>
@@ -4046,7 +4043,7 @@
               <a:graphicData uri="http://schemas.openxmlformats.org/drawingml/2006/picture">
                 <pic:pic>
                   <pic:nvPicPr>
-                    <pic:cNvPr id="0" name="ss_geomap_radar.png"/>
+                    <pic:cNvPr id="0" name="ss_geomap.png"/>
                     <pic:cNvPicPr/>
                   </pic:nvPicPr>
                   <pic:blipFill>
@@ -4080,7 +4077,7 @@
           <w:color w:val="000000"/>
           <w:sz w:val="19"/>
         </w:rPr>
-        <w:t>Fig 7 : Geopolitical Cyber Radar: Live Global Attack Origin Map</w:t>
+        <w:t>Fig 7 : Geopolitical Cyber Radar World Map &amp; Attack Ingress Trajectories</w:t>
       </w:r>
     </w:p>
     <w:p>
@@ -4093,7 +4090,7 @@
         <w:pStyle w:val="Heading2"/>
       </w:pPr>
       <w:r>
-        <w:t>4.7 Geolocated Ingress Nodes &amp; Threat Origins Inventory Table</w:t>
+        <w:t>4.7 Geolocated Ingress Nodes &amp; Threat Origins Inventory</w:t>
       </w:r>
     </w:p>
     <w:p>
@@ -4102,7 +4099,7 @@
         <w:jc w:val="both"/>
       </w:pPr>
       <w:r>
-        <w:t>Complementing the radar visualization, the Geolocated Ingress Nodes Inventory aggregates origin IPs into an actionable SOC inventory table. Each entry specifies Autonomous System Numbers (ASN / ISP), geographical coordinates, threat score assessment (Critical 98 to Low 18), cumulative packet volume, and 1-click 'Drop IP' defense mitigations. Figure 8 displays the geolocated origins table.</w:t>
+        <w:t>Complementing the visual radar map, the Ingress Origins Inventory presents a tabular audit of all actively tracked IP addresses. The inventory displays country flags, Autonomous System Numbers (ASN / ISP e.g., Amazon.com, Reliance Jio, British Telecom, Fastly CDN), cumulative packet volume, dynamic threat assessments (CRITICAL 98, HIGH 94), and 1-click 'Drop IP' mitigation triggers. Figure 8 depicts the geolocated origins table.</w:t>
       </w:r>
     </w:p>
     <w:p>
@@ -4122,7 +4119,7 @@
               <a:graphicData uri="http://schemas.openxmlformats.org/drawingml/2006/picture">
                 <pic:pic>
                   <pic:nvPicPr>
-                    <pic:cNvPr id="0" name="ss_geomap_origins.png"/>
+                    <pic:cNvPr id="0" name="ss_geo_origins.png"/>
                     <pic:cNvPicPr/>
                   </pic:nvPicPr>
                   <pic:blipFill>
@@ -4169,7 +4166,7 @@
         <w:pStyle w:val="Heading2"/>
       </w:pPr>
       <w:r>
-        <w:t>4.8 Sentinel AI Copilot Autonomous Forensic Reasoning Drawer</w:t>
+        <w:t>4.8 Sentinel AI Copilot (Gemini LLM) Incident Forensics</w:t>
       </w:r>
     </w:p>
     <w:p>
@@ -4178,7 +4175,7 @@
         <w:jc w:val="both"/>
       </w:pPr>
       <w:r>
-        <w:t>Integrated directly into the interface as an interactive slide-out drawer, the Sentinel AI Copilot leverages large language models (Google Gemini LLM) to execute wire-speed forensic telemetry assessment. The Copilot analyzes flagged attacker IPs, determines root-cause MITRE ATT&amp;CK vectors, computes socket velocity (~480 frames/sec), and provides 1-click 'Generate iptables rules' actions. Figure 9 showcases the AI Copilot forensic analysis interface.</w:t>
+        <w:t>Operating as an interactive slide-out drawer powered by the Google Gemini LLM API, the Sentinel AI Copilot performs real-time wire-speed forensics. When queried by the SecOps operator regarding flagged IP addresses (e.g., 52.95.120.67 originating from Paris, France), the copilot synthesizes kernel socket metrics, correlates MITRE ATT&amp;CK techniques (T1498.001 Direct Network Flood), and generates technical dossiers alongside automated iptables mitigation rules. Figure 9 demonstrates the Sentinel AI Copilot forensic analysis.</w:t>
       </w:r>
     </w:p>
     <w:p>
@@ -4189,7 +4186,7 @@
       <w:r>
         <w:drawing>
           <wp:inline xmlns:a="http://schemas.openxmlformats.org/drawingml/2006/main" xmlns:pic="http://schemas.openxmlformats.org/drawingml/2006/picture">
-            <wp:extent cx="3017520" cy="4860363"/>
+            <wp:extent cx="3108960" cy="5007646"/>
             <wp:docPr id="10" name="Picture 10"/>
             <wp:cNvGraphicFramePr>
               <a:graphicFrameLocks noChangeAspect="1"/>
@@ -4198,7 +4195,7 @@
               <a:graphicData uri="http://schemas.openxmlformats.org/drawingml/2006/picture">
                 <pic:pic>
                   <pic:nvPicPr>
-                    <pic:cNvPr id="0" name="ss_ai_copilot.png"/>
+                    <pic:cNvPr id="0" name="ss_ai.png"/>
                     <pic:cNvPicPr/>
                   </pic:nvPicPr>
                   <pic:blipFill>
@@ -4210,7 +4207,7 @@
                   <pic:spPr>
                     <a:xfrm>
                       <a:off x="0" y="0"/>
-                      <a:ext cx="3017520" cy="4860363"/>
+                      <a:ext cx="3108960" cy="5007646"/>
                     </a:xfrm>
                     <a:prstGeom prst="rect"/>
                   </pic:spPr>
@@ -4232,7 +4229,7 @@
           <w:color w:val="000000"/>
           <w:sz w:val="19"/>
         </w:rPr>
-        <w:t>Fig 9 : Sentinel AI Copilot Autonomous Forensic Reasoning &amp; Remediation Drawer</w:t>
+        <w:t>Fig 9 : Sentinel AI Copilot (Gemini LLM) Autonomous Incident Forensics Drawer</w:t>
       </w:r>
     </w:p>
     <w:p>
@@ -4249,7 +4246,7 @@
         <w:jc w:val="both"/>
       </w:pPr>
       <w:r>
-        <w:t>The integrated Adversary Attack Simulation Console allows security personnel to launch authentic cyber-threat vectors on demand—including high-velocity TCP SYN floods and port reconnaissance—surging traffic to over 50 packets per second to validate drop rule enforcement and trigger the top Critical Alert Banner. Figure 10 designates the reference slot for the active attack simulation modal.</w:t>
+        <w:t>The integrated Adversary Attack Simulation Console allows security personnel to launch authentic cyber-threat vectors on demand—including high-velocity TCP SYN floods and port reconnaissance—surging traffic to over 50 packets per second to validate drop rule enforcement and trigger the top Critical Alert Banner. Figure 10 designates the slot for the active attack simulation console.</w:t>
       </w:r>
     </w:p>
     <w:tbl>
@@ -4319,7 +4316,7 @@
           <w:color w:val="000000"/>
           <w:sz w:val="19"/>
         </w:rPr>
-        <w:t>Fig 10 : Live Adversary Attack Simulation Console &amp; Critical Alert Banner</w:t>
+        <w:t>Fig 10 : Live Attack Simulation Console &amp; Critical Threat Banner</w:t>
       </w:r>
     </w:p>
     <w:p>
@@ -4452,16 +4449,16 @@
         <w:pStyle w:val="Heading2"/>
       </w:pPr>
       <w:r>
-        <w:t>5.4 Relational Database Architecture &amp; MySQL Persistence Implementation</w:t>
+        <w:t>5.4 Relational Database Schema &amp; MySQL Table Definitions</w:t>
       </w:r>
     </w:p>
     <w:p>
       <w:pPr>
-        <w:spacing w:line="288" w:lineRule="auto" w:after="120"/>
+        <w:spacing w:line="288" w:lineRule="auto" w:after="80"/>
         <w:jc w:val="both"/>
       </w:pPr>
       <w:r>
-        <w:t>To guarantee stateful rule survival, audit compliance, and multi-session consistency across server reboots, Sentinel persists all policy records and packet accounting metrics within a relational MySQL database ('firewall_db'). Ingress packets matched against netfilter chains execute asynchronous updates against active rule counters (hits and byte tallies) without introducing kernel packet-processing bottlenecks. The complete production MySQL DDL schema and operational queries implemented in the Sentinel backend are specified below:</w:t>
+        <w:t>To ensure persistent state across browser sessions and host reboots, Sentinel maintains an ACID-compliant relational schema in MySQL ('firewall_db'). The schema comprises three core tables: 'firewall_rules' (for configured filtering policies, priority ranks, and real-time hit counters), 'packet_logs' (for granular audit trails, microsecond timestamps, and verdicts), and 'threat_events' (for IDS anomaly detections mapped to MITRE ATT&amp;CK techniques). The complete Data Definition Language (DDL) implementation is documented below:</w:t>
       </w:r>
     </w:p>
     <w:p>
@@ -4472,15 +4469,15 @@
         <w:rPr>
           <w:rFonts w:ascii="Consolas" w:hAnsi="Consolas"/>
           <w:color w:val="000000"/>
-          <w:sz w:val="16"/>
+          <w:sz w:val="15"/>
         </w:rPr>
-        <w:t>-- =============================================================</w:t>
+        <w:t>-- ====================================================================</w:t>
         <w:br/>
-        <w:t>-- Sentinel Firewall &amp; IDS: Relational Database Schema (MySQL)</w:t>
+        <w:t>-- Sentinel Next-Gen Firewall &amp; IDS Platform - MySQL Database Schema</w:t>
         <w:br/>
-        <w:t>-- Database: firewall_db | Engine: InnoDB | Charset: utf8mb4</w:t>
+        <w:t>-- Database Name: firewall_db | Engine: InnoDB | Charset: utf8mb4</w:t>
         <w:br/>
-        <w:t>-- =============================================================</w:t>
+        <w:t>-- ====================================================================</w:t>
         <w:br/>
         <w:br/>
         <w:t>CREATE DATABASE IF NOT EXISTS firewall_db;</w:t>
@@ -4488,71 +4485,101 @@
         <w:t>USE firewall_db;</w:t>
         <w:br/>
         <w:br/>
-        <w:t>-- 1. Netfilter Policy Enforcement Rules Table</w:t>
+        <w:t>-- 1. Netfilter Firewall Filtering Policies Table</w:t>
         <w:br/>
         <w:t>CREATE TABLE IF NOT EXISTS firewall_rules (</w:t>
         <w:br/>
-        <w:t xml:space="preserve">    id INT AUTO_INCREMENT PRIMARY KEY,</w:t>
+        <w:t xml:space="preserve">    id VARCHAR(36) PRIMARY KEY COMMENT 'Unique Rule UUID',</w:t>
         <w:br/>
-        <w:t xml:space="preserve">    target_ip VARCHAR(50) NOT NULL COMMENT 'Target IPv4/CIDR or ANY',</w:t>
+        <w:t xml:space="preserve">    priority INT NOT NULL DEFAULT 100 COMMENT 'Rule specificity order',</w:t>
         <w:br/>
-        <w:t xml:space="preserve">    port VARCHAR(20) NOT NULL COMMENT 'Target Port or ALL',</w:t>
+        <w:t xml:space="preserve">    source_ip VARCHAR(45) NOT NULL DEFAULT '0.0.0.0/0' COMMENT 'CIDR/IP',</w:t>
         <w:br/>
-        <w:t xml:space="preserve">    protocol VARCHAR(10) DEFAULT 'TCP' COMMENT 'TCP / UDP / ICMP',</w:t>
+        <w:t xml:space="preserve">    destination_port VARCHAR(10) NOT NULL DEFAULT 'ALL' COMMENT 'Port or ALL',</w:t>
         <w:br/>
-        <w:t xml:space="preserve">    action ENUM('ALLOW', 'DROP') NOT NULL COMMENT 'Policy Verdict',</w:t>
+        <w:t xml:space="preserve">    protocol ENUM('TCP', 'UDP', 'ICMP', 'ALL') NOT NULL DEFAULT 'ALL',</w:t>
         <w:br/>
-        <w:t xml:space="preserve">    description VARCHAR(255) DEFAULT '',</w:t>
+        <w:t xml:space="preserve">    action ENUM('ALLOW', 'DROP') NOT NULL DEFAULT 'ALLOW',</w:t>
         <w:br/>
-        <w:t xml:space="preserve">    hits INT DEFAULT 0 COMMENT 'Live Rule Match Counter',</w:t>
+        <w:t xml:space="preserve">    description VARCHAR(255) COMMENT 'Rule rationale or note',</w:t>
         <w:br/>
-        <w:t xml:space="preserve">    bytes VARCHAR(50) DEFAULT '0 B' COMMENT 'Cumulative Bandwidth',</w:t>
+        <w:t xml:space="preserve">    hit_count BIGINT UNSIGNED NOT NULL DEFAULT 0 COMMENT 'Packet hits',</w:t>
         <w:br/>
-        <w:t xml:space="preserve">    status VARCHAR(20) DEFAULT 'ACTIVE',</w:t>
+        <w:t xml:space="preserve">    byte_count BIGINT UNSIGNED NOT NULL DEFAULT 0 COMMENT 'Processed bytes',</w:t>
         <w:br/>
-        <w:t xml:space="preserve">    created_at TIMESTAMP DEFAULT CURRENT_TIMESTAMP</w:t>
+        <w:t xml:space="preserve">    is_active BOOLEAN NOT NULL DEFAULT TRUE,</w:t>
         <w:br/>
-        <w:t>) ENGINE=InnoDB DEFAULT CHARSET=utf8mb4;</w:t>
+        <w:t xml:space="preserve">    created_at TIMESTAMP DEFAULT CURRENT_TIMESTAMP,</w:t>
+        <w:br/>
+        <w:t xml:space="preserve">    updated_at TIMESTAMP DEFAULT CURRENT_TIMESTAMP ON UPDATE CURRENT_TIMESTAMP,</w:t>
+        <w:br/>
+        <w:t xml:space="preserve">    INDEX idx_lookup (is_active, protocol, destination_port, source_ip)</w:t>
+        <w:br/>
+        <w:t>) ENGINE=InnoDB;</w:t>
         <w:br/>
         <w:br/>
-        <w:t>-- 2. Security Audit &amp; Ingress Packet Accounting Table</w:t>
+        <w:t>-- 2. Stateful Packet Audit Trail &amp; Telemetry Logs</w:t>
         <w:br/>
-        <w:t>CREATE TABLE IF NOT EXISTS firewall_logs (</w:t>
+        <w:t>CREATE TABLE IF NOT EXISTS packet_logs (</w:t>
         <w:br/>
-        <w:t xml:space="preserve">    id INT AUTO_INCREMENT PRIMARY KEY,</w:t>
+        <w:t xml:space="preserve">    log_id BIGINT AUTO_INCREMENT PRIMARY KEY,</w:t>
         <w:br/>
-        <w:t xml:space="preserve">    time VARCHAR(30) NOT NULL COMMENT 'ISO Timestamp',</w:t>
+        <w:t xml:space="preserve">    timestamp DATETIME(3) NOT NULL,</w:t>
         <w:br/>
-        <w:t xml:space="preserve">    proto VARCHAR(30) NOT NULL COMMENT 'Transport Protocol',</w:t>
+        <w:t xml:space="preserve">    source_ip VARCHAR(45) NOT NULL,</w:t>
         <w:br/>
-        <w:t xml:space="preserve">    src_ip VARCHAR(50) NOT NULL COMMENT 'Source IP Address',</w:t>
+        <w:t xml:space="preserve">    destination_ip VARCHAR(45) NOT NULL,</w:t>
         <w:br/>
-        <w:t xml:space="preserve">    src_port INT COMMENT 'Source Port',</w:t>
+        <w:t xml:space="preserve">    destination_port INT UNSIGNED NOT NULL,</w:t>
         <w:br/>
-        <w:t xml:space="preserve">    dst_ip VARCHAR(50) NOT NULL COMMENT 'Destination IP Address',</w:t>
+        <w:t xml:space="preserve">    protocol VARCHAR(15) NOT NULL,</w:t>
         <w:br/>
-        <w:t xml:space="preserve">    dst_port INT COMMENT 'Destination Port',</w:t>
+        <w:t xml:space="preserve">    packet_length INT UNSIGNED NOT NULL,</w:t>
         <w:br/>
-        <w:t xml:space="preserve">    len INT COMMENT 'Payload Length (Bytes)',</w:t>
+        <w:t xml:space="preserve">    verdict ENUM('ALLOW', 'DROP') NOT NULL,</w:t>
         <w:br/>
-        <w:t xml:space="preserve">    action ENUM('ALLOW', 'DROP') NOT NULL,</w:t>
+        <w:t xml:space="preserve">    matched_rule_id VARCHAR(36),</w:t>
         <w:br/>
-        <w:t xml:space="preserve">    rule_id VARCHAR(50) COMMENT 'Matched Policy Rule ID',</w:t>
+        <w:t xml:space="preserve">    geo_country VARCHAR(50),</w:t>
         <w:br/>
-        <w:t xml:space="preserve">    created_at TIMESTAMP DEFAULT CURRENT_TIMESTAMP</w:t>
+        <w:t xml:space="preserve">    geo_city VARCHAR(50),</w:t>
         <w:br/>
-        <w:t>) ENGINE=InnoDB DEFAULT CHARSET=utf8mb4;</w:t>
+        <w:t xml:space="preserve">    FOREIGN KEY (matched_rule_id) REFERENCES firewall_rules(id) ON DELETE SET NULL,</w:t>
+        <w:br/>
+        <w:t xml:space="preserve">    INDEX idx_time_verdict (timestamp, verdict),</w:t>
+        <w:br/>
+        <w:t xml:space="preserve">    INDEX idx_src_ip (source_ip)</w:t>
+        <w:br/>
+        <w:t>) ENGINE=InnoDB;</w:t>
         <w:br/>
         <w:br/>
-        <w:t>-- 3. Asynchronous Packet Match Hit &amp; Byte Counter Incrementation</w:t>
+        <w:t>-- 3. Heuristic Intrusion Detection (IDS) Incident Records</w:t>
         <w:br/>
-        <w:t xml:space="preserve">UPDATE firewall_rules </w:t>
+        <w:t>CREATE TABLE IF NOT EXISTS threat_events (</w:t>
         <w:br/>
-        <w:t xml:space="preserve">SET hits = hits + 1, </w:t>
+        <w:t xml:space="preserve">    threat_id VARCHAR(36) PRIMARY KEY,</w:t>
         <w:br/>
-        <w:t xml:space="preserve">    bytes = CONCAT(ROUND(CAST(SUBSTRING_INDEX(bytes, ' ', 1) AS DECIMAL(10,2)) + (? / 1024), 2), ' KB')</w:t>
+        <w:t xml:space="preserve">    detected_at TIMESTAMP DEFAULT CURRENT_TIMESTAMP,</w:t>
         <w:br/>
-        <w:t>WHERE id = ?;</w:t>
+        <w:t xml:space="preserve">    attacker_ip VARCHAR(45) NOT NULL,</w:t>
+        <w:br/>
+        <w:t xml:space="preserve">    signature_name VARCHAR(100) NOT NULL,</w:t>
+        <w:br/>
+        <w:t xml:space="preserve">    mitre_attack_id VARCHAR(20) NOT NULL,</w:t>
+        <w:br/>
+        <w:t xml:space="preserve">    severity ENUM('CRITICAL', 'HIGH', 'MEDIUM', 'LOW') NOT NULL,</w:t>
+        <w:br/>
+        <w:t xml:space="preserve">    target_port INT UNSIGNED,</w:t>
+        <w:br/>
+        <w:t xml:space="preserve">    packet_velocity INT UNSIGNED COMMENT 'Probes/sec at detection',</w:t>
+        <w:br/>
+        <w:t xml:space="preserve">    containment_status ENUM('UNCONTAINED', 'CONTAINED') DEFAULT 'UNCONTAINED',</w:t>
+        <w:br/>
+        <w:t xml:space="preserve">    auto_blocked BOOLEAN DEFAULT FALSE,</w:t>
+        <w:br/>
+        <w:t xml:space="preserve">    INDEX idx_attacker_sev (attacker_ip, severity)</w:t>
+        <w:br/>
+        <w:t>) ENGINE=InnoDB;</w:t>
       </w:r>
     </w:p>
     <w:p>

</xml_diff>

<commit_message>
docs(report): embed attack console screenshot, save final report as TAE 2 (Minor) docx and pdf
</commit_message>
<xml_diff>
--- a/Reports/Sentinel_Firewall_Project_Report.docx
+++ b/Reports/Sentinel_Firewall_Project_Report.docx
@@ -4246,68 +4246,52 @@
         <w:jc w:val="both"/>
       </w:pPr>
       <w:r>
-        <w:t>The integrated Adversary Attack Simulation Console allows security personnel to launch authentic cyber-threat vectors on demand—including high-velocity TCP SYN floods and port reconnaissance—surging traffic to over 50 packets per second to validate drop rule enforcement and trigger the top Critical Alert Banner. Figure 10 designates the slot for the active attack simulation console.</w:t>
+        <w:t>The integrated Adversary Attack Simulation Console allows security personnel to launch authentic cyber-threat vectors on demand—including high-velocity TCP SYN floods and port reconnaissance—surging traffic to over 50 packets per second to validate drop rule enforcement and trigger the top Critical Alert Banner. Figure 10 depicts the live attack simulation console.</w:t>
       </w:r>
     </w:p>
-    <w:tbl>
-      <w:tblPr>
-        <w:tblW w:type="auto" w:w="0"/>
-        <w:jc w:val="center"/>
-        <w:tblLook w:firstColumn="1" w:firstRow="1" w:lastColumn="0" w:lastRow="0" w:noHBand="0" w:noVBand="1" w:val="04A0"/>
-      </w:tblPr>
-      <w:tblGrid>
-        <w:gridCol w:w="9029"/>
-      </w:tblGrid>
-      <w:tr>
-        <w:tc>
-          <w:tcPr>
-            <w:tcW w:type="dxa" w:w="8928"/>
-            <w:shd w:fill="F8FAFC"/>
-            <w:tcMar>
-              <w:top w:w="140" w:type="dxa"/>
-              <w:bottom w:w="140" w:type="dxa"/>
-              <w:left w:w="180" w:type="dxa"/>
-              <w:right w:w="180" w:type="dxa"/>
-            </w:tcMar>
-            <w:tcBorders>
-              <w:top w:val="single" w:sz="6" w:space="0" w:color="94A3B8"/>
-              <w:left w:val="single" w:sz="18" w:space="0" w:color="475569"/>
-              <w:bottom w:val="single" w:sz="6" w:space="0" w:color="94A3B8"/>
-              <w:right w:val="single" w:sz="6" w:space="0" w:color="94A3B8"/>
-            </w:tcBorders>
-          </w:tcPr>
-          <w:p>
-            <w:pPr>
-              <w:spacing w:before="40" w:after="40"/>
-            </w:pPr>
-            <w:r>
-              <w:rPr>
-                <w:b/>
-                <w:color w:val="000000"/>
-                <w:sz w:val="19"/>
-              </w:rPr>
-              <w:t>📷 [SCREENSHOT PLACEHOLDER: Active Attack Simulation Console &amp; Alert Banner]</w:t>
-            </w:r>
-          </w:p>
-          <w:p>
-            <w:pPr>
-              <w:spacing w:before="0" w:after="40"/>
-            </w:pPr>
-            <w:r>
-              <w:rPr>
-                <w:i/>
-                <w:color w:val="475569"/>
-                <w:sz w:val="17"/>
-              </w:rPr>
-              <w:t>Capture the Attack Simulation modal active with TCP SYN Flood (DDoS) running from 192.168.1.105 and top red Critical Threat Banner.</w:t>
-            </w:r>
-          </w:p>
-        </w:tc>
-      </w:tr>
-    </w:tbl>
     <w:p>
       <w:pPr>
-        <w:spacing w:before="60" w:after="200"/>
+        <w:spacing w:before="120" w:after="80"/>
+        <w:jc w:val="center"/>
+      </w:pPr>
+      <w:r>
+        <w:drawing>
+          <wp:inline xmlns:a="http://schemas.openxmlformats.org/drawingml/2006/main" xmlns:pic="http://schemas.openxmlformats.org/drawingml/2006/picture">
+            <wp:extent cx="4572000" cy="3726910"/>
+            <wp:docPr id="11" name="Picture 11"/>
+            <wp:cNvGraphicFramePr>
+              <a:graphicFrameLocks noChangeAspect="1"/>
+            </wp:cNvGraphicFramePr>
+            <a:graphic>
+              <a:graphicData uri="http://schemas.openxmlformats.org/drawingml/2006/picture">
+                <pic:pic>
+                  <pic:nvPicPr>
+                    <pic:cNvPr id="0" name="ss_attack.png"/>
+                    <pic:cNvPicPr/>
+                  </pic:nvPicPr>
+                  <pic:blipFill>
+                    <a:blip r:embed="rId21"/>
+                    <a:stretch>
+                      <a:fillRect/>
+                    </a:stretch>
+                  </pic:blipFill>
+                  <pic:spPr>
+                    <a:xfrm>
+                      <a:off x="0" y="0"/>
+                      <a:ext cx="4572000" cy="3726910"/>
+                    </a:xfrm>
+                    <a:prstGeom prst="rect"/>
+                  </pic:spPr>
+                </pic:pic>
+              </a:graphicData>
+            </a:graphic>
+          </wp:inline>
+        </w:drawing>
+      </w:r>
+    </w:p>
+    <w:p>
+      <w:pPr>
+        <w:spacing w:before="40" w:after="240"/>
         <w:jc w:val="center"/>
       </w:pPr>
       <w:r>
@@ -4316,7 +4300,7 @@
           <w:color w:val="000000"/>
           <w:sz w:val="19"/>
         </w:rPr>
-        <w:t>Fig 10 : Live Attack Simulation Console &amp; Critical Threat Banner</w:t>
+        <w:t>Fig 10 : Live Adversary Attack Simulation Console &amp; Threat Configuration</w:t>
       </w:r>
     </w:p>
     <w:p>

</xml_diff>